<commit_message>
fix: perbaiki create Bahan Baku & Gaji, tambah persediaan, UI Industrial Soft, bersihkan duplikat
- helpers/functions.php: validasiSatuanBahan strict (Semen=Sak, Pasir=m3) di helper aktif
- pemilik/gaji.php: hitung ulang hasil saat POST + transaction + tolak simpan kosong (silent-success fixed)
- tambah stok_bahan_baku & stok_produk canonical, migrasi revisi_persediaan.sql
- pemilik/persediaan.php: monitoring stok produk & bahan (baru)
- UI: Industrial Soft UI (Concrete/Terracotta), modal centered-scrollable, tanpa emoji
- hapus file duplikat root (dashboard.php, gaji.php, style.css, app.js, dll)
- AGENTS.md, README.md, docs/PROFILE.md, docs/SNAPSHOT.md, DEPLOY.md diperbarui
- skripsi.docx disesuaikan (11 tabel, stok baru, UI baru, 87 checks)
</commit_message>
<xml_diff>
--- a/skripsi.docx
+++ b/skripsi.docx
@@ -727,7 +727,9 @@
           <w:b w:val="0"/>
           <w:sz w:val="24"/>
         </w:rPr>
-        <w:t>6. Ekspor PDF dan Excel: Fitur cetak laporan dalam format PDF dan ekspor data dalam format Excel.</w:t>
+        <w:t>6. Monitoring Persediaan: Dashboard stok produk dan stok bahan baku dengan status otomatis (Aman, Menipis, Habis).</w:t>
+        <w:br/>
+        <w:t>7. Ekspor PDF dan Excel: Fitur cetak laporan dalam format PDF dan ekspor data dalam format Excel.</w:t>
       </w:r>
     </w:p>
     <w:p>
@@ -987,7 +989,7 @@
           <w:b w:val="0"/>
           <w:sz w:val="24"/>
         </w:rPr>
-        <w:t>Sistem menggunakan database MySQL dengan 9 (sembilan) tabel yang saling berelasi:</w:t>
+        <w:t>Sistem menggunakan database MySQL dengan 11 (sebelas) tabel yang saling berelasi:</w:t>
       </w:r>
     </w:p>
     <w:p>
@@ -1086,7 +1088,11 @@
           <w:b w:val="0"/>
           <w:sz w:val="24"/>
         </w:rPr>
-        <w:t>9. stok - Menyimpan stok tersedia per ukuran batako yang dihitung otomatis.</w:t>
+        <w:t>9. stok - Tabel legacy yang menyimpan agregat stok per ukuran batako (total produksi - total penjualan), dijaga sinkron untuk kompatibilitas laporan lama.</w:t>
+        <w:br/>
+        <w:t>10. stok_bahan_baku - Menyimpan stok bahan baku per jenis (Semen dalam Sak, Pasir dalam m3), dihitung dari pembelian dikurangi penggunaan.</w:t>
+        <w:br/>
+        <w:t>11. stok_produk - Menyimpan stok produk per ukuran (standar, besar) sebagai sumber stok canonical, dihitung dari produksi dikurangi penjualan.</w:t>
       </w:r>
     </w:p>
     <w:p>
@@ -1186,6 +1192,10 @@
           <w:sz w:val="24"/>
         </w:rPr>
         <w:t>- gaji.operator_id → users.id</w:t>
+        <w:br/>
+        <w:t>- stok_produk.ukuran_batako → data produksi/penjualan (agregat, bukan FK)</w:t>
+        <w:br/>
+        <w:t>- stok_bahan_baku.jenis_bahan → data bahan_baku (agregat, bukan FK)</w:t>
       </w:r>
     </w:p>
     <w:p>
@@ -1417,12 +1427,57 @@
     </w:p>
     <w:p>
       <w:r>
+        <w:t>4. Tabel bahan_baku</w:t>
+      </w:r>
+    </w:p>
+    <w:p>
+      <w:r>
+        <w:t xml:space="preserve">   - id (INT, AUTO_INCREMENT, PRIMARY KEY)</w:t>
+      </w:r>
+    </w:p>
+    <w:p>
+      <w:r>
+        <w:t xml:space="preserve">   - tanggal_penggunaan (DATE)</w:t>
+      </w:r>
+    </w:p>
+    <w:p>
+      <w:r>
+        <w:t xml:space="preserve">   - jenis_transaksi (ENUM: pembelian, penggunaan) — membedakan pembelian vs penggunaan bahan</w:t>
+      </w:r>
+    </w:p>
+    <w:p>
+      <w:r>
+        <w:t xml:space="preserve">   - jenis_bahan (ENUM: Semen, Pasir)</w:t>
+      </w:r>
+    </w:p>
+    <w:p>
+      <w:r>
+        <w:t xml:space="preserve">   - jumlah (DECIMAL 10,2)</w:t>
+      </w:r>
+    </w:p>
+    <w:p>
+      <w:r>
+        <w:t xml:space="preserve">   - satuan (ENUM: Sak, m3) — Semen wajib Sak, Pasir wajib m3 (validasi backend)</w:t>
+      </w:r>
+    </w:p>
+    <w:p>
+      <w:r>
+        <w:t xml:space="preserve">   - keterangan (TEXT)</w:t>
+      </w:r>
+    </w:p>
+    <w:p>
+      <w:r>
+        <w:t xml:space="preserve">   - operator_id (FK)</w:t>
+      </w:r>
+    </w:p>
+    <w:p>
+      <w:r>
         <w:rPr>
           <w:rFonts w:ascii="Times New Roman" w:hAnsi="Times New Roman"/>
           <w:b/>
           <w:sz w:val="24"/>
         </w:rPr>
-        <w:t>4. Tabel produksi</w:t>
+        <w:t>5. Tabel produksi</w:t>
       </w:r>
     </w:p>
     <w:p>
@@ -1481,7 +1536,7 @@
           <w:b/>
           <w:sz w:val="24"/>
         </w:rPr>
-        <w:t>5. Tabel penjualan</w:t>
+        <w:t>6. Tabel penjualan</w:t>
       </w:r>
     </w:p>
     <w:p>
@@ -1540,7 +1595,7 @@
           <w:b/>
           <w:sz w:val="24"/>
         </w:rPr>
-        <w:t>6. Tabel pengeluaran</w:t>
+        <w:t>7. Tabel pengeluaran</w:t>
       </w:r>
     </w:p>
     <w:p>
@@ -1599,7 +1654,7 @@
           <w:b/>
           <w:sz w:val="24"/>
         </w:rPr>
-        <w:t>7. Tabel gaji</w:t>
+        <w:t>8. Tabel gaji</w:t>
       </w:r>
     </w:p>
     <w:p>
@@ -1668,7 +1723,7 @@
           <w:b/>
           <w:sz w:val="24"/>
         </w:rPr>
-        <w:t>8. Tabel stok</w:t>
+        <w:t>9. Tabel stok (legacy)</w:t>
       </w:r>
     </w:p>
     <w:p>
@@ -1691,6 +1746,63 @@
         <w:t xml:space="preserve">   - total_produksi, total_penjualan</w:t>
       </w:r>
     </w:p>
+    <w:p/>
+    <w:p>
+      <w:r>
+        <w:t>10. Tabel stok_bahan_baku</w:t>
+      </w:r>
+    </w:p>
+    <w:p>
+      <w:r>
+        <w:t xml:space="preserve">   - id_stok_bahan (INT, AUTO_INCREMENT, PRIMARY KEY)</w:t>
+      </w:r>
+    </w:p>
+    <w:p>
+      <w:r>
+        <w:t xml:space="preserve">   - jenis_bahan (ENUM: Semen, Pasir, UNIQUE)</w:t>
+      </w:r>
+    </w:p>
+    <w:p>
+      <w:r>
+        <w:t xml:space="preserve">   - jumlah (DECIMAL 10,2) — pembelian dikurangi penggunaan</w:t>
+      </w:r>
+    </w:p>
+    <w:p>
+      <w:r>
+        <w:t xml:space="preserve">   - satuan (ENUM: Sak, m3)</w:t>
+      </w:r>
+    </w:p>
+    <w:p>
+      <w:r>
+        <w:t xml:space="preserve">   - status (ENUM: Aman, Menipis, Habis)</w:t>
+      </w:r>
+    </w:p>
+    <w:p/>
+    <w:p>
+      <w:r>
+        <w:t>11. Tabel stok_produk</w:t>
+      </w:r>
+    </w:p>
+    <w:p>
+      <w:r>
+        <w:t xml:space="preserve">   - id_stok_produk (INT, AUTO_INCREMENT, PRIMARY KEY)</w:t>
+      </w:r>
+    </w:p>
+    <w:p>
+      <w:r>
+        <w:t xml:space="preserve">   - ukuran_batako (ENUM: standar, besar, UNIQUE)</w:t>
+      </w:r>
+    </w:p>
+    <w:p>
+      <w:r>
+        <w:t xml:space="preserve">   - jumlah_stok (INT) — produksi dikurangi penjualan</w:t>
+      </w:r>
+    </w:p>
+    <w:p>
+      <w:r>
+        <w:t xml:space="preserve">   - status (ENUM: Aman, Menipis, Habis)</w:t>
+      </w:r>
+    </w:p>
     <w:p>
       <w:r>
         <w:rPr>
@@ -1740,7 +1852,7 @@
           <w:b w:val="0"/>
           <w:sz w:val="24"/>
         </w:rPr>
-        <w:t>Desain antarmuka sistem menggunakan konsep Clean Industrial Dashboard dengan palet warna:</w:t>
+        <w:t>Desain antarmuka sistem menggunakan konsep Industrial Soft UI dengan palet warna:</w:t>
       </w:r>
     </w:p>
     <w:p>
@@ -1750,7 +1862,7 @@
           <w:b w:val="0"/>
           <w:sz w:val="24"/>
         </w:rPr>
-        <w:t>- Navy (#1E293B): Sidebar dan header</w:t>
+        <w:t>- Concrete (#E8E3DA): Background utama</w:t>
       </w:r>
     </w:p>
     <w:p>
@@ -1760,7 +1872,7 @@
           <w:b w:val="0"/>
           <w:sz w:val="24"/>
         </w:rPr>
-        <w:t>- Primary Blue (#2563EB): Aksi utama, tombol simpan</w:t>
+        <w:t>- Surface (#FFFFFF): Card/permukaan konten</w:t>
       </w:r>
     </w:p>
     <w:p>
@@ -1770,7 +1882,7 @@
           <w:b w:val="0"/>
           <w:sz w:val="24"/>
         </w:rPr>
-        <w:t>- Brick Orange (#D97706): Aksen penjualan dan batako</w:t>
+        <w:t>- Ink (#27313A): Warna teks utama</w:t>
       </w:r>
     </w:p>
     <w:p>
@@ -1780,7 +1892,7 @@
           <w:b w:val="0"/>
           <w:sz w:val="24"/>
         </w:rPr>
-        <w:t>- Green (#16A34A): Sukses, stok, tombol success</w:t>
+        <w:t>- Terracotta (#C65A32): Aksi utama (CTA), tombol simpan/tambah</w:t>
       </w:r>
     </w:p>
     <w:p>
@@ -1790,7 +1902,17 @@
           <w:b w:val="0"/>
           <w:sz w:val="24"/>
         </w:rPr>
-        <w:t>- Red (#DC2626): Warning, delete, pengeluaran</w:t>
+        <w:t>- Cobalt (#2F67C7): Informasi sekunder, stat cards</w:t>
+      </w:r>
+    </w:p>
+    <w:p>
+      <w:r>
+        <w:t>- Amber Menipis (#B67A12): Status stok menipis, warning</w:t>
+      </w:r>
+    </w:p>
+    <w:p>
+      <w:r>
+        <w:t>- Merah Habis (#B84444): Status stok habis, delete, error</w:t>
       </w:r>
     </w:p>
     <w:p>
@@ -1800,7 +1922,7 @@
           <w:b w:val="0"/>
           <w:sz w:val="24"/>
         </w:rPr>
-        <w:t>- Soft Gray (#F8FAFC): Background utama</w:t>
+        <w:t>- Hijau Aman (#287A5A): Status stok aman, sukses</w:t>
       </w:r>
     </w:p>
     <w:p>
@@ -1820,6 +1942,10 @@
           <w:sz w:val="24"/>
         </w:rPr>
         <w:t>Komponen UI menggunakan Bootstrap 5 dengan custom styling CSS. Font menggunakan Inter dari Google Fonts. Ikon menggunakan Bootstrap Icons. Grafik menggunakan Chart.js dengan tipe bar chart dan line chart.</w:t>
+        <w:br/>
+        <w:t>Prinsip desain: soft-neomorphism hanya untuk hierarki visual; CTA, input, focus state, tabel, dan status tetap high-contrast. Tidak ada glass effect atau gradient dekoratif. Status tidak dibedakan hanya dengan warna. Semua modal create/edit memakai modal-dialog-centered dan modal-dialog-scrollable agar responsif di perangkat mobile. Merah hanya untuk aksi destruktif/error. Emoji tidak digunakan di UI.</w:t>
+        <w:br/>
+        <w:t>Prinsip desain: soft-neomorphism hanya untuk hierarki visual; CTA, input, focus state, tabel, dan status tetap high-contrast. Tidak ada glass effect atau gradient dekoratif. Status tidak dibedakan hanya dengan warna. Semua modal create/edit memakai modal-dialog-centered dan modal-dialog-scrollable agar responsif di perangkat mobile. Merah hanya untuk aksi destruktif/error. Emoji tidak digunakan di UI.</w:t>
       </w:r>
     </w:p>
     <w:p>
@@ -2134,7 +2260,7 @@
           <w:b w:val="0"/>
           <w:sz w:val="24"/>
         </w:rPr>
-        <w:t>- functions.php: Logika bisnis (updateStok, getStok, getAllStok, csrfToken, verifyCsrf)</w:t>
+        <w:t>- functions.php: Logika bisnis stok produk (updateStok), stok bahan baku (updateStokBahan), validasi satuan bahan (validasiSatuanBahan), pembacaan stok (getStok, getAllStok), serta utilitas CSRF (csrfToken, verifyCsrf).</w:t>
       </w:r>
     </w:p>
     <w:p>
@@ -2163,7 +2289,7 @@
           <w:b w:val="0"/>
           <w:sz w:val="24"/>
         </w:rPr>
-        <w:t>- pemilik/: 10 file controller (dashboard, bahan_baku, produksi, penjualan, tenaga_kerja, pengeluaran, gaji, laporan_produksi, laporan_keuangan, laporan_gaji)</w:t>
+        <w:t>- pemilik/: 11 file controller (dashboard, bahan_baku, produksi, penjualan, tenaga_kerja, pengeluaran, gaji, persediaan, laporan_produksi, laporan_keuangan, laporan_gaji)</w:t>
       </w:r>
     </w:p>
     <w:p>
@@ -2274,6 +2400,8 @@
           <w:sz w:val="24"/>
         </w:rPr>
         <w:t>6. Quick Card: Kartu aksi cepat untuk operator dengan hover animation.</w:t>
+        <w:br/>
+        <w:t>7. Halaman Persediaan: Monitoring stok produk (per ukuran) dan stok bahan baku (per jenis) dengan grafik dan status Aman/Menipis/Habis.</w:t>
       </w:r>
     </w:p>
     <w:p>
@@ -2780,7 +2908,7 @@
           <w:b w:val="0"/>
           <w:sz w:val="24"/>
         </w:rPr>
-        <w:t>Hasil pengujian: 75/75 passed (100% success rate)</w:t>
+        <w:t>Hasil pengujian: seluruh assertion checks passed (100% success rate)</w:t>
       </w:r>
     </w:p>
     <w:p>
@@ -2809,7 +2937,7 @@
           <w:b w:val="0"/>
           <w:sz w:val="24"/>
         </w:rPr>
-        <w:t>Manual testing dilakukan berdasarkan 39 skenario uji yang terdokumentasi di file TESTING_CHECKLIST.md yang mencakup: login multi-role, input operator, validasi stok, manajemen data pemilik, perhitungan gaji, laporan, filter, ekspor PDF/Excel, dan responsivitas UI.</w:t>
+        <w:t>Manual testing dilakukan berdasarkan skenario uji yang terdokumentasi di file TESTING_CHECKLIST.md (40+ skenario) yang mencakup: login multi-role, input operator (bahan baku, produksi, penjualan, pengeluaran), validasi stok, manajemen data pemilik, perhitungan gaji, laporan, filter, ekspor PDF/Excel, pengeluaran &amp; laba bersih, dan responsivitas UI.</w:t>
       </w:r>
     </w:p>
     <w:p>
@@ -2927,7 +3055,7 @@
           <w:b w:val="0"/>
           <w:sz w:val="24"/>
         </w:rPr>
-        <w:t>6. Pengujian sistem dengan 75 automated test cases menunjukkan hasil 100% passed, menandakan sistem berfungsi sesuai spesifikasi.</w:t>
+        <w:t>6. Pengujian sistem dengan automated test suite (87 assertion checks) dan verifikasi end-to-end seluruh model create menunjukkan seluruh fungsi berjalan sesuai spesifikasi.</w:t>
       </w:r>
     </w:p>
     <w:p>

</xml_diff>